<commit_message>
Lynch: nur Koloskopie-Befund-Baustein, Rest entfernt
</commit_message>
<xml_diff>
--- a/Lynch_ASS_Arztbrief_Textbausteine.docx
+++ b/Lynch_ASS_Arztbrief_Textbausteine.docx
@@ -15,7 +15,7 @@
           <w:sz w:val="36"/>
           <w:szCs w:val="36"/>
         </w:rPr>
-        <w:t xml:space="preserve">Lynch-Syndrom &amp; ASS – Textbausteine</w:t>
+        <w:t xml:space="preserve">Lynch-Syndrom &amp; ASS – Textbaustein</w:t>
       </w:r>
     </w:p>
     <w:p>
@@ -47,12 +47,12 @@
           <w:sz w:val="28"/>
           <w:szCs w:val="28"/>
         </w:rPr>
-        <w:t xml:space="preserve">Baustein 1 – Arztbrief an Hausarzt / betreuenden Arzt</w:t>
-      </w:r>
-    </w:p>
-    <w:p>
-      <w:pPr>
-        <w:spacing w:after="80" w:before="60"/>
+        <w:t xml:space="preserve">Koloskopie-Befund bei Lynch-Syndrom</w:t>
+      </w:r>
+    </w:p>
+    <w:p>
+      <w:pPr>
+        <w:spacing w:after="100" w:before="60"/>
         <w:jc w:val="both"/>
       </w:pPr>
       <w:r>
@@ -61,41 +61,12 @@
           <w:sz w:val="22"/>
           <w:szCs w:val="22"/>
         </w:rPr>
-        <w:t xml:space="preserve">Diagnose: Gesichertes Lynch-Syndrom ([Mutationsnachweis: z. B. MLH1/MSH2/MSH6/PMS2/EPCAM]). Wir empfehlen die Einnahme von Acetylsalicylsäure (ASS) 100 mg/Tag (enteric coated) zur Reduktion des kolorektalen Karzinomrisikos. Die Therapie sollte für mindestens 2 Jahre kontinuierlich eingenommen werden. Der protektive Effekt tritt verzögert auf (ca. 5 Jahre) und hält über 10 Jahre an. Bitte besprechen Sie die individuelle Nutzen-Risiko-Abwägung mit dem/der Patient:in (Blutungsrisiko, Magenverträglichkeit, Komedikation). Bei gastrointestinalen Risikofaktoren ggf. PPI-Komedikation erwägen. ASS ist in dieser Indikation Off-Label (Stand: 2025). Kontraindikationen: schwere Magen-Darm-Blutungsanamnese, bekannte ASS-Unverträglichkeit, schwere Leber-/Niereninsuffizienz, gleichzeitige Antikoagulation (relative KI).</w:t>
-      </w:r>
-    </w:p>
-    <w:p>
-      <w:pPr>
-        <w:spacing w:after="200" w:before="200"/>
-      </w:pPr>
-      <w:r>
-        <w:rPr>
-          <w:color w:val="c8dede"/>
-          <w:sz w:val="18"/>
-          <w:szCs w:val="18"/>
-        </w:rPr>
-        <w:t xml:space="preserve">─────────────────────────────────────────</w:t>
-      </w:r>
-    </w:p>
-    <w:p>
-      <w:pPr>
-        <w:spacing w:after="120" w:before="360"/>
-      </w:pPr>
-      <w:r>
-        <w:rPr>
-          <w:rFonts w:ascii="Calibri" w:cs="Calibri" w:eastAsia="Calibri" w:hAnsi="Calibri"/>
-          <w:b/>
-          <w:bCs/>
-          <w:color w:val="0C4E54"/>
-          <w:sz w:val="28"/>
-          <w:szCs w:val="28"/>
-        </w:rPr>
-        <w:t xml:space="preserve">Baustein 2 – Koloskopie-Befund bei Lynch-Syndrom</w:t>
-      </w:r>
-    </w:p>
-    <w:p>
-      <w:pPr>
-        <w:spacing w:after="80" w:before="60"/>
+        <w:t xml:space="preserve">Koloskopie-Indikation: Surveillance bei Lynch-Syndrom ([Mutation]).</w:t>
+      </w:r>
+    </w:p>
+    <w:p>
+      <w:pPr>
+        <w:spacing w:after="100" w:before="60"/>
         <w:jc w:val="both"/>
       </w:pPr>
       <w:r>
@@ -104,41 +75,12 @@
           <w:sz w:val="22"/>
           <w:szCs w:val="22"/>
         </w:rPr>
-        <w:t xml:space="preserve">Koloskopie-Indikation: Surveillance bei Lynch-Syndrom ([Mutation]). [Befundbeschreibung: z. B. Kein Polyp nachweisbar. / Polyp abgetragen, Histologie angefordert. / etc.] Bei gesichertem Lynch-Syndrom empfehlen wir die tägliche Einnahme von ASS 100 mg (enteric coated) zur Chemoprävention des kolorektalen Karzinoms. Bitte ggf. mit dem weiterbehandelnden Arzt besprechen.</w:t>
-      </w:r>
-    </w:p>
-    <w:p>
-      <w:pPr>
-        <w:spacing w:after="200" w:before="200"/>
-      </w:pPr>
-      <w:r>
-        <w:rPr>
-          <w:color w:val="c8dede"/>
-          <w:sz w:val="18"/>
-          <w:szCs w:val="18"/>
-        </w:rPr>
-        <w:t xml:space="preserve">─────────────────────────────────────────</w:t>
-      </w:r>
-    </w:p>
-    <w:p>
-      <w:pPr>
-        <w:spacing w:after="120" w:before="360"/>
-      </w:pPr>
-      <w:r>
-        <w:rPr>
-          <w:rFonts w:ascii="Calibri" w:cs="Calibri" w:eastAsia="Calibri" w:hAnsi="Calibri"/>
-          <w:b/>
-          <w:bCs/>
-          <w:color w:val="0C4E54"/>
-          <w:sz w:val="28"/>
-          <w:szCs w:val="28"/>
-        </w:rPr>
-        <w:t xml:space="preserve">Baustein 3 – Aufklärungsgespräch ASS (Lynch-Syndrom)</w:t>
-      </w:r>
-    </w:p>
-    <w:p>
-      <w:pPr>
-        <w:spacing w:after="80" w:before="60"/>
+        <w:t xml:space="preserve">[Befundbeschreibung: z. B. Kein Polyp nachweisbar. / Polyp abgetragen, Histologie angefordert.]</w:t>
+      </w:r>
+    </w:p>
+    <w:p>
+      <w:pPr>
+        <w:spacing w:after="100" w:before="60"/>
         <w:jc w:val="both"/>
       </w:pPr>
       <w:r>
@@ -147,7 +89,7 @@
           <w:sz w:val="22"/>
           <w:szCs w:val="22"/>
         </w:rPr>
-        <w:t xml:space="preserve">ASS wird hier nicht als Schmerzmittel, sondern zur Krebsvorbeugung in niedriger Dosis (100 mg) eingesetzt. Der Wirkungsmechanismus beruht auf einer Hemmung des Enzyms COX-2, das Tumorzellen beim Wachstum unterstützt, sowie einer Stärkung der körpereigenen Immunüberwachung im Darm. Der Schutzeffekt baut sich langsam auf: nach ca. 5 Jahren ist er am stärksten ausgeprägt und hält über 10 Jahre an, auch nach Absetzen von ASS. In der CAPP2-Studie entwickelten 9 % der ASS-Gruppe vs. 13 % der Placebo-Gruppe Darmkrebs – auf Lebenszeit ein relevanter Unterschied. Die CAPP3-Studie (2025) zeigt: 100 mg/Tag wirkt genauso gut wie 600 mg, ist aber verträglicher. Einnahmedauer: mindestens 2 Jahre durchgängig, langfristig idealerweise dauerhaft. Risiko: erhöhtes Magenblutungsrisiko; bei Magenproblemen gleichzeitig Magenschutz (PPI) erwägen; bei Antikoagulation ärztliche Rücksprache.</w:t>
+        <w:t xml:space="preserve">Bei gesichertem Lynch-Syndrom empfehlen wir die tägliche Einnahme von ASS 100 mg (enteric coated) zur Chemoprävention des kolorektalen Karzinoms. Bitte ggf. mit dem weiterbehandelnden Arzt besprechen.</w:t>
       </w:r>
     </w:p>
     <w:p>
@@ -163,58 +105,12 @@
           <w:sz w:val="19"/>
           <w:szCs w:val="19"/>
         </w:rPr>
-        <w:t xml:space="preserve">ASS ist in dieser Indikation Off-Label. Eine dokumentierte Aufklärung ist medizinisch und rechtlich erforderlich. Empfehlung: Kurzvermerk im Arztbrief „Nutzen-Risiko-Gespräch am [Datum] geführt, Patient:in einverstanden." Kein Rezept erforderlich (OTC-Präparat), aber ärztliche Dokumentation sinnvoll.</w:t>
-      </w:r>
-    </w:p>
-    <w:p>
-      <w:pPr>
-        <w:spacing w:after="200" w:before="200"/>
-      </w:pPr>
-      <w:r>
-        <w:rPr>
-          <w:color w:val="c8dede"/>
-          <w:sz w:val="18"/>
-          <w:szCs w:val="18"/>
-        </w:rPr>
-        <w:t xml:space="preserve">─────────────────────────────────────────</w:t>
-      </w:r>
-    </w:p>
-    <w:p>
-      <w:pPr>
-        <w:spacing w:after="120" w:before="360"/>
-      </w:pPr>
-      <w:r>
-        <w:rPr>
-          <w:rFonts w:ascii="Calibri" w:cs="Calibri" w:eastAsia="Calibri" w:hAnsi="Calibri"/>
-          <w:b/>
-          <w:bCs/>
-          <w:color w:val="0C4E54"/>
-          <w:sz w:val="28"/>
-          <w:szCs w:val="28"/>
-        </w:rPr>
-        <w:t xml:space="preserve">Anhang – Lynch-Syndrom: Risikospektrum</w:t>
-      </w:r>
-    </w:p>
-    <w:p>
-      <w:pPr>
-        <w:spacing w:after="80" w:before="100"/>
-        <w:jc w:val="both"/>
-      </w:pPr>
-      <w:r>
-        <w:rPr>
-          <w:rFonts w:ascii="Calibri" w:cs="Calibri" w:eastAsia="Calibri" w:hAnsi="Calibri"/>
-          <w:i/>
-          <w:iCs/>
-          <w:color w:val="6B7F80"/>
-          <w:sz w:val="19"/>
-          <w:szCs w:val="19"/>
-        </w:rPr>
-        <w:t xml:space="preserve">Risikospektrum: MLH1/MSH2: KRK 40–80 %, Endometrium 40–60 %; MSH6: KRK 10–22 %, Endometrium 44–71 %; PMS2: KRK 15–20 %, Endometrium 15 %; EPCAM: KRK 75 %, Endometrium ~12 %. Koloskopie-Surveillance alle 1–2 Jahre ab 25 Jahren (S3-Leitlinie KRK 2023).</w:t>
-      </w:r>
-    </w:p>
-    <w:p>
-      <w:pPr>
-        <w:spacing w:before="400"/>
+        <w:t xml:space="preserve">ASS ist in dieser Indikation Off-Label. Aufklärung und Dokumentation empfohlen.</w:t>
+      </w:r>
+    </w:p>
+    <w:p>
+      <w:pPr>
+        <w:spacing w:before="480"/>
       </w:pPr>
       <w:r>
         <w:rPr>

</xml_diff>

<commit_message>
Lynch B1: HP/MSH2-Satz ergänzt
</commit_message>
<xml_diff>
--- a/Lynch_ASS_Arztbrief_Textbausteine.docx
+++ b/Lynch_ASS_Arztbrief_Textbausteine.docx
@@ -93,6 +93,33 @@
       </w:r>
     </w:p>
     <w:p>
+      <w:r>
+        <w:rPr>
+          <w:b w:val="0"/>
+          <w:i w:val="0"/>
+          <w:sz w:val="22"/>
+        </w:rPr>
+        <w:t>Bei Erstdiagnose eines Lynch-Syndroms empfehlen wir eine humangenetische Beratung sowie eine Keimbahndiagnostik der MMR-Gene (MLH1, MSH2, MSH6, PMS2, EPCAM), sofern noch nicht erfolgt. Erstgradig Verwandte sollten ebenfalls beraten werden.</w:t>
+      </w:r>
+    </w:p>
+    <w:p>
+      <w:r>
+        <w:rPr>
+          <w:sz w:val="22"/>
+        </w:rPr>
+        <w:t>Bei Nachweis einer MSH2-Mutation empfehlen wir zusätzlich ein Screening auf Helicobacter pylori sowie eine Eradikation bei positivem Nachweis, da MSH2-Träger ein erhöhtes Risiko für Magenkarzinome aufweisen.</w:t>
+      </w:r>
+    </w:p>
+    <w:p>
+      <w:r>
+        <w:rPr>
+          <w:b w:val="0"/>
+          <w:i w:val="0"/>
+          <w:sz w:val="22"/>
+        </w:rPr>
+      </w:r>
+    </w:p>
+    <w:p>
       <w:pPr>
         <w:spacing w:after="80" w:before="60"/>
       </w:pPr>
@@ -122,6 +149,70 @@
           <w:szCs w:val="18"/>
         </w:rPr>
         <w:t xml:space="preserve">Dr. med. Kristin Koschny · Assistenzärztin Gastroenterologie · GFGB-Jahrestagung 2026</w:t>
+      </w:r>
+    </w:p>
+    <w:p/>
+    <w:p>
+      <w:r>
+        <w:rPr>
+          <w:b w:val="0"/>
+          <w:i w:val="0"/>
+          <w:sz w:val="22"/>
+        </w:rPr>
+        <w:t>Bei Nachweis von ≥10 Adenomen in der Koloskopie empfehlen wir eine humangenetische Beratung zum Ausschluss eines hereditären Polyposis-Syndroms (u.a. attenuierte FAP, MUTYH-assoziierte Polyposis). Dies gilt auch bei zufälligem Befund im Rahmen der Vorsorgekoloskopie.</w:t>
+      </w:r>
+    </w:p>
+    <w:p>
+      <w:r>
+        <w:rPr>
+          <w:b/>
+          <w:i w:val="0"/>
+          <w:sz w:val="22"/>
+        </w:rPr>
+        <w:t>Baustein 2 – Zufallsbefund ≥10 Adenome in der Koloskopie</w:t>
+      </w:r>
+    </w:p>
+    <w:p>
+      <w:r>
+        <w:rPr>
+          <w:b w:val="0"/>
+          <w:i w:val="0"/>
+          <w:color w:val="BBBBBB"/>
+          <w:sz w:val="18"/>
+        </w:rPr>
+        <w:t>───────────────────────────────────────────────────────</w:t>
+      </w:r>
+    </w:p>
+    <w:p/>
+    <w:p>
+      <w:r>
+        <w:rPr>
+          <w:b w:val="0"/>
+          <w:i w:val="0"/>
+          <w:sz w:val="22"/>
+        </w:rPr>
+        <w:t>Bei Nachweis eines Magenkarzinoms vom diffusen Typ (Siegelringzellkarzinom / lobuläres Wachstumsmuster) empfehlen wir eine ausführliche Familienanamnese hinsichtlich diffuser Magenkarzinome und lobulärer Mammakarzinome. Bei Erfüllung der IGCLC-Kriterien (u.a. ≥2 Fälle von diffusem Magenkarzinom in der Familie, Erstdiagnose vor dem 50. Lebensjahr, oder diffuses Magenkarzinom vor dem 35. Lebensjahr) empfehlen wir eine humangenetische Beratung und ggf. CDH1-Keimbahndiagnostik.</w:t>
+      </w:r>
+    </w:p>
+    <w:p>
+      <w:r>
+        <w:rPr>
+          <w:b/>
+          <w:i w:val="0"/>
+          <w:sz w:val="22"/>
+        </w:rPr>
+        <w:t>Baustein 3 – Diffuses Magenkarzinom (Verdacht HDGC / CDH1-Mutation)</w:t>
+      </w:r>
+    </w:p>
+    <w:p>
+      <w:r>
+        <w:rPr>
+          <w:b w:val="0"/>
+          <w:i w:val="0"/>
+          <w:color w:val="BBBBBB"/>
+          <w:sz w:val="18"/>
+        </w:rPr>
+        <w:t>───────────────────────────────────────────────────────</w:t>
       </w:r>
     </w:p>
     <w:sectPr>

</xml_diff>

<commit_message>
Baustein 4: Hereditäres Pankreaskarzinom (BRCA1/2, PALB2, ATM)
</commit_message>
<xml_diff>
--- a/Lynch_ASS_Arztbrief_Textbausteine.docx
+++ b/Lynch_ASS_Arztbrief_Textbausteine.docx
@@ -135,22 +135,6 @@
         <w:t xml:space="preserve">ASS ist in dieser Indikation Off-Label. Aufklärung und Dokumentation empfohlen.</w:t>
       </w:r>
     </w:p>
-    <w:p>
-      <w:pPr>
-        <w:spacing w:before="480"/>
-      </w:pPr>
-      <w:r>
-        <w:rPr>
-          <w:rFonts w:ascii="Calibri" w:cs="Calibri" w:eastAsia="Calibri" w:hAnsi="Calibri"/>
-          <w:i/>
-          <w:iCs/>
-          <w:color w:val="6B7F80"/>
-          <w:sz w:val="18"/>
-          <w:szCs w:val="18"/>
-        </w:rPr>
-        <w:t xml:space="preserve">Dr. med. Kristin Koschny · Assistenzärztin Gastroenterologie · GFGB-Jahrestagung 2026</w:t>
-      </w:r>
-    </w:p>
     <w:p/>
     <w:p>
       <w:r>
@@ -213,6 +197,132 @@
           <w:sz w:val="18"/>
         </w:rPr>
         <w:t>───────────────────────────────────────────────────────</w:t>
+      </w:r>
+    </w:p>
+    <w:p>
+      <w:r>
+        <w:rPr>
+          <w:b w:val="0"/>
+          <w:i w:val="0"/>
+          <w:color w:val="BBBBBB"/>
+          <w:sz w:val="18"/>
+        </w:rPr>
+        <w:t>───────────────────────────────────────────────────────</w:t>
+      </w:r>
+    </w:p>
+    <w:p/>
+    <w:p>
+      <w:r>
+        <w:rPr>
+          <w:b/>
+          <w:i w:val="0"/>
+          <w:sz w:val="22"/>
+        </w:rPr>
+        <w:t>Baustein 4 – Hereditäres Pankreaskarzinom (BRCA1/2 · PALB2 · ATM)</w:t>
+      </w:r>
+    </w:p>
+    <w:p>
+      <w:r>
+        <w:rPr>
+          <w:b/>
+          <w:i w:val="0"/>
+          <w:sz w:val="22"/>
+        </w:rPr>
+        <w:t>BRCA1/2-Mutation</w:t>
+      </w:r>
+    </w:p>
+    <w:p>
+      <w:r>
+        <w:rPr>
+          <w:b w:val="0"/>
+          <w:i w:val="0"/>
+          <w:sz w:val="22"/>
+        </w:rPr>
+        <w:t>Bei dem Patienten / der Patientin wurde eine BRCA1/2-Keimbahnmutation nachgewiesen. Wir empfehlen eine Vorstellung in einer humangenetischen Beratungsstelle zur Familienberatung und Testung erstgradig Verwandter. Therapeutisch ist die Mutation relevant: Bei metastasiertem BRCA1/2-mutiertem Pankreaskarzinom ist eine Therapie mit PARP-Inhibitoren (Olaparib) zugelassen; wir empfehlen eine Besprechung im interdisziplinären Tumorboard.</w:t>
+      </w:r>
+    </w:p>
+    <w:p>
+      <w:r>
+        <w:rPr>
+          <w:b w:val="0"/>
+          <w:i w:val="0"/>
+          <w:sz w:val="22"/>
+        </w:rPr>
+        <w:t>Zur Früherkennung empfehlen wir bei Mutationsträgern mit positiver Pankreas-Familienanamnese eine Surveillance mittels Endosonographie und/oder MRT-MRCP ab dem 50. Lebensjahr (bzw. 10 Jahre vor dem jüngsten Erkrankungsalter in der Familie) gemäß CAPS-Konsortium-Leitlinien.</w:t>
+      </w:r>
+    </w:p>
+    <w:p/>
+    <w:p>
+      <w:r>
+        <w:rPr>
+          <w:b/>
+          <w:i w:val="0"/>
+          <w:sz w:val="22"/>
+        </w:rPr>
+        <w:t>PALB2-Mutation</w:t>
+      </w:r>
+    </w:p>
+    <w:p>
+      <w:r>
+        <w:rPr>
+          <w:b w:val="0"/>
+          <w:i w:val="0"/>
+          <w:sz w:val="22"/>
+        </w:rPr>
+        <w:t>Bei dem Patienten / der Patientin wurde eine PALB2-Keimbahnmutation nachgewiesen. PALB2 ist nach BRCA2 der zweithäufigste hereditäre Risikofaktor für das Pankreaskarzinom und ebenfalls mit einem erhöhten Mammakarzinomrisiko assoziiert. Wir empfehlen eine humangenetische Beratung und Testung erstgradig Verwandter sowie eine Surveillance wie bei BRCA2 (s.o.).</w:t>
+      </w:r>
+    </w:p>
+    <w:p/>
+    <w:p>
+      <w:r>
+        <w:rPr>
+          <w:b/>
+          <w:i w:val="0"/>
+          <w:sz w:val="22"/>
+        </w:rPr>
+        <w:t>ATM-Mutation</w:t>
+      </w:r>
+    </w:p>
+    <w:p>
+      <w:r>
+        <w:rPr>
+          <w:b w:val="0"/>
+          <w:i w:val="0"/>
+          <w:sz w:val="22"/>
+        </w:rPr>
+        <w:t>Bei dem Patienten / der Patientin wurde eine heterozygote ATM-Keimbahnmutation nachgewiesen. ATM-Mutationen sind mit einem 2–5-fach erhöhten Pankreaskarzinomrisiko assoziiert. Wir empfehlen eine humangenetische Beratung. Bei positiver Familienanamnese für Pankreaskarzinom empfehlen wir eine Surveillance analog den CAPS-Empfehlungen.</w:t>
+      </w:r>
+    </w:p>
+    <w:p/>
+    <w:p>
+      <w:r>
+        <w:rPr>
+          <w:b w:val="0"/>
+          <w:i/>
+          <w:sz w:val="18"/>
+        </w:rPr>
+        <w:t>Surveillance-Empfehlungen basieren auf den CAPS-Konsortium-Leitlinien (Gastroenterology 2020). Individuelle Risikostratifizierung in Absprache mit einem spezialisierten Zentrum empfohlen.</w:t>
+      </w:r>
+    </w:p>
+    <w:p>
+      <w:r>
+        <w:rPr>
+          <w:b w:val="0"/>
+          <w:i w:val="0"/>
+          <w:color w:val="BBBBBB"/>
+          <w:sz w:val="18"/>
+        </w:rPr>
+        <w:t>───────────────────────────────────────────────────────</w:t>
+      </w:r>
+    </w:p>
+    <w:p>
+      <w:r>
+        <w:rPr>
+          <w:b w:val="0"/>
+          <w:i/>
+          <w:sz w:val="18"/>
+        </w:rPr>
+        <w:t>Dr. med. Kristin Koschny · Assistenzärztin Gastroenterologie · GFGB-Jahrestagung 2026</w:t>
       </w:r>
     </w:p>
     <w:sectPr>

</xml_diff>

<commit_message>
Adenome + Magen CA entfernt; Pankreas zu B2 umbenannt
</commit_message>
<xml_diff>
--- a/Lynch_ASS_Arztbrief_Textbausteine.docx
+++ b/Lynch_ASS_Arztbrief_Textbausteine.docx
@@ -139,45 +139,12 @@
     <w:p>
       <w:r>
         <w:rPr>
-          <w:b w:val="0"/>
-          <w:i w:val="0"/>
-          <w:sz w:val="22"/>
-        </w:rPr>
-        <w:t>Bei Nachweis von ≥10 Adenomen in der Koloskopie empfehlen wir eine humangenetische Beratung zum Ausschluss eines hereditären Polyposis-Syndroms (u.a. attenuierte FAP, MUTYH-assoziierte Polyposis). Dies gilt auch bei zufälligem Befund im Rahmen der Vorsorgekoloskopie.</w:t>
-      </w:r>
-    </w:p>
-    <w:p>
-      <w:r>
-        <w:rPr>
-          <w:b/>
-          <w:i w:val="0"/>
-          <w:sz w:val="22"/>
-        </w:rPr>
-        <w:t>Baustein 2 – Zufallsbefund ≥10 Adenome in der Koloskopie</w:t>
-      </w:r>
-    </w:p>
-    <w:p>
-      <w:r>
-        <w:rPr>
-          <w:b w:val="0"/>
-          <w:i w:val="0"/>
           <w:color w:val="BBBBBB"/>
           <w:sz w:val="18"/>
         </w:rPr>
         <w:t>───────────────────────────────────────────────────────</w:t>
       </w:r>
     </w:p>
-    <w:p/>
-    <w:p>
-      <w:r>
-        <w:rPr>
-          <w:b w:val="0"/>
-          <w:i w:val="0"/>
-          <w:sz w:val="22"/>
-        </w:rPr>
-        <w:t>Bei Nachweis eines Magenkarzinoms vom diffusen Typ (Siegelringzellkarzinom / lobuläres Wachstumsmuster) empfehlen wir eine ausführliche Familienanamnese hinsichtlich diffuser Magenkarzinome und lobulärer Mammakarzinome. Bei Erfüllung der IGCLC-Kriterien (u.a. ≥2 Fälle von diffusem Magenkarzinom in der Familie, Erstdiagnose vor dem 50. Lebensjahr, oder diffuses Magenkarzinom vor dem 35. Lebensjahr) empfehlen wir eine humangenetische Beratung und ggf. CDH1-Keimbahndiagnostik.</w:t>
-      </w:r>
-    </w:p>
     <w:p>
       <w:r>
         <w:rPr>
@@ -185,40 +152,7 @@
           <w:i w:val="0"/>
           <w:sz w:val="22"/>
         </w:rPr>
-        <w:t>Baustein 3 – Diffuses Magenkarzinom (Verdacht HDGC / CDH1-Mutation)</w:t>
-      </w:r>
-    </w:p>
-    <w:p>
-      <w:r>
-        <w:rPr>
-          <w:b w:val="0"/>
-          <w:i w:val="0"/>
-          <w:color w:val="BBBBBB"/>
-          <w:sz w:val="18"/>
-        </w:rPr>
-        <w:t>───────────────────────────────────────────────────────</w:t>
-      </w:r>
-    </w:p>
-    <w:p>
-      <w:r>
-        <w:rPr>
-          <w:b w:val="0"/>
-          <w:i w:val="0"/>
-          <w:color w:val="BBBBBB"/>
-          <w:sz w:val="18"/>
-        </w:rPr>
-        <w:t>───────────────────────────────────────────────────────</w:t>
-      </w:r>
-    </w:p>
-    <w:p/>
-    <w:p>
-      <w:r>
-        <w:rPr>
-          <w:b/>
-          <w:i w:val="0"/>
-          <w:sz w:val="22"/>
-        </w:rPr>
-        <w:t>Baustein 4 – Hereditäres Pankreaskarzinom (BRCA1/2 · PALB2 · ATM)</w:t>
+        <w:t>Baustein 2 – Hereditäres Pankreaskarzinom (BRCA1/2 · PALB2 · ATM)</w:t>
       </w:r>
     </w:p>
     <w:p>

</xml_diff>

<commit_message>
Lynch B1: Titel vereinfacht, 1. ASS 2. Genetik 3. HP nummeriert
</commit_message>
<xml_diff>
--- a/Lynch_ASS_Arztbrief_Textbausteine.docx
+++ b/Lynch_ASS_Arztbrief_Textbausteine.docx
@@ -15,7 +15,7 @@
           <w:sz w:val="36"/>
           <w:szCs w:val="36"/>
         </w:rPr>
-        <w:t xml:space="preserve">Lynch-Syndrom &amp; ASS – Textbaustein</w:t>
+        <w:t>Lynch-Syndrom – Textbaustein</w:t>
       </w:r>
     </w:p>
     <w:p>
@@ -47,7 +47,7 @@
           <w:sz w:val="28"/>
           <w:szCs w:val="28"/>
         </w:rPr>
-        <w:t xml:space="preserve">Koloskopie-Befund bei Lynch-Syndrom</w:t>
+        <w:t>Koloskopie-Befund bei Lynch-Syndrom</w:t>
       </w:r>
     </w:p>
     <w:p>
@@ -89,25 +89,25 @@
           <w:sz w:val="22"/>
           <w:szCs w:val="22"/>
         </w:rPr>
-        <w:t xml:space="preserve">Bei gesichertem Lynch-Syndrom empfehlen wir die tägliche Einnahme von ASS 100 mg (enteric coated) zur Chemoprävention des kolorektalen Karzinoms. Bitte ggf. mit dem weiterbehandelnden Arzt besprechen.</w:t>
-      </w:r>
-    </w:p>
-    <w:p>
-      <w:r>
-        <w:rPr>
-          <w:b w:val="0"/>
-          <w:i w:val="0"/>
-          <w:sz w:val="22"/>
-        </w:rPr>
-        <w:t>Bei Erstdiagnose eines Lynch-Syndroms empfehlen wir eine humangenetische Beratung sowie eine Keimbahndiagnostik der MMR-Gene (MLH1, MSH2, MSH6, PMS2, EPCAM), sofern noch nicht erfolgt. Erstgradig Verwandte sollten ebenfalls beraten werden.</w:t>
-      </w:r>
-    </w:p>
-    <w:p>
-      <w:r>
-        <w:rPr>
-          <w:sz w:val="22"/>
-        </w:rPr>
-        <w:t>Bei Nachweis einer MSH2-Mutation empfehlen wir zusätzlich ein Screening auf Helicobacter pylori sowie eine Eradikation bei positivem Nachweis, da MSH2-Träger ein erhöhtes Risiko für Magenkarzinome aufweisen.</w:t>
+        <w:t>1. ASS zur Chemoprävention: Bei gesichertem Lynch-Syndrom empfehlen wir die tägliche Einnahme von ASS 100 mg (enteric coated) zur Chemoprävention des kolorektalen Karzinoms. Bitte ggf. mit dem weiterbehandelnden Arzt besprechen.</w:t>
+      </w:r>
+    </w:p>
+    <w:p>
+      <w:r>
+        <w:rPr>
+          <w:b w:val="0"/>
+          <w:i w:val="0"/>
+          <w:sz w:val="22"/>
+        </w:rPr>
+        <w:t>2. Humangenetische Beratung: Bei Erstdiagnose eines Lynch-Syndroms empfehlen wir eine humangenetische Beratung sowie eine Keimbahndiagnostik der MMR-Gene (MLH1, MSH2, MSH6, PMS2, EPCAM), sofern noch nicht erfolgt. Erstgradig Verwandte sollten ebenfalls beraten werden.</w:t>
+      </w:r>
+    </w:p>
+    <w:p>
+      <w:r>
+        <w:rPr>
+          <w:sz w:val="22"/>
+        </w:rPr>
+        <w:t>3. H.-pylori-Screening: Bei Nachweis einer MSH2-Mutation empfehlen wir ein Screening auf Helicobacter pylori sowie eine Eradikation bei positivem Nachweis, da MSH2-Träger ein erhöhtes Risiko für Magenkarzinome aufweisen.</w:t>
       </w:r>
     </w:p>
     <w:p>

</xml_diff>